<commit_message>
pathways edits and docx builds
</commit_message>
<xml_diff>
--- a/chapters/exports/01-intro.docx
+++ b/chapters/exports/01-intro.docx
@@ -23,9 +23,6 @@
         <w:pStyle w:val="Heading2"/>
       </w:pPr>
       <w:r>
-        <w:t xml:space="preserve">1.1	</w:t>
-      </w:r>
-      <w:r>
         <w:t xml:space="preserve">About</w:t>
       </w:r>
     </w:p>
@@ -33,7 +30,7 @@
       <w:r>
         <w:t xml:space="preserve">The </w:t>
       </w:r>
-      <w:hyperlink w:history="1" r:id="rIdmfivswiurk9x1npmygbkp">
+      <w:hyperlink w:history="1" r:id="rId5im2t_lzcnvgv_jf80kvu">
         <w:r>
           <w:rPr>
             <w:rStyle w:val="Hyperlink"/>
@@ -50,9 +47,6 @@
         <w:pStyle w:val="Heading2"/>
       </w:pPr>
       <w:r>
-        <w:t xml:space="preserve">1.2	</w:t>
-      </w:r>
-      <w:r>
         <w:t xml:space="preserve">Funding</w:t>
       </w:r>
     </w:p>
@@ -60,7 +54,7 @@
       <w:r>
         <w:t xml:space="preserve">Funding for the Forest Business Alliance is provided by the </w:t>
       </w:r>
-      <w:hyperlink w:history="1" r:id="rId3iqwtebfv6d3xdlcneotp">
+      <w:hyperlink w:history="1" r:id="rIde4f_qqq2hael-cjocjcm9">
         <w:r>
           <w:rPr>
             <w:rStyle w:val="Hyperlink"/>
@@ -69,9 +63,9 @@
         </w:r>
       </w:hyperlink>
       <w:r>
-        <w:t xml:space="preserve"> and the </w:t>
-      </w:r>
-      <w:hyperlink w:history="1" r:id="rIddpsnoen2zunwq1zmj5yjq">
+        <w:t xml:space="preserve">. Past funders include the </w:t>
+      </w:r>
+      <w:hyperlink w:history="1" r:id="rIdvwmouqb7wjro73txtqyof">
         <w:r>
           <w:rPr>
             <w:rStyle w:val="Hyperlink"/>
@@ -80,7 +74,7 @@
         </w:r>
       </w:hyperlink>
       <w:r>
-        <w:t xml:space="preserve">.</w:t>
+        <w:t xml:space="preserve"> and USDA Forest Service.</w:t>
       </w:r>
     </w:p>
     <w:p>
@@ -133,17 +127,14 @@
         <w:pStyle w:val="Heading2"/>
       </w:pPr>
       <w:r>
-        <w:t xml:space="preserve">1.3	</w:t>
-      </w:r>
-      <w:r>
         <w:t xml:space="preserve">Audience</w:t>
       </w:r>
     </w:p>
     <w:p>
       <w:r>
-        <w:t xml:space="preserve">Businesses, Tribal organizations, nonprofits, and other entities creating sustainable wood product facilities and businesses. The guide offers key insights and advice to access funds. More information and templates for the CAL FIRE Business and Workforce Development and USDA Forest Service Wood Innovation Grants can be found at the </w:t>
-      </w:r>
-      <w:hyperlink w:history="1" r:id="rIdlvw6nvaizakbhjqo9lytz">
+        <w:t xml:space="preserve">Businesses, Tribal organizations, nonprofits, and other entities are creating sustainable wood product facilities and businesses. The guide provides key insights and advice on accessing funds. More information and templates for the CAL FIRE Business and Workforce Development and USDA Forest Service Wood Innovation Grants can be found at the </w:t>
+      </w:r>
+      <w:hyperlink w:history="1" r:id="rIdjoqe2g4un38dehyb8ctk4">
         <w:r>
           <w:rPr>
             <w:rStyle w:val="Hyperlink"/>
@@ -154,7 +145,7 @@
       <w:r>
         <w:t xml:space="preserve"> website. Feedback is welcome. Contact us directly at </w:t>
       </w:r>
-      <w:hyperlink w:history="1" r:id="rIdu6n520u8loxy4qxwb6etx">
+      <w:hyperlink w:history="1" r:id="rIdd5k6fmxcmsllkysqlcg4r">
         <w:r>
           <w:rPr>
             <w:rStyle w:val="Hyperlink"/>
@@ -171,15 +162,12 @@
         <w:pStyle w:val="Heading2"/>
       </w:pPr>
       <w:r>
-        <w:t xml:space="preserve">1.4	</w:t>
-      </w:r>
-      <w:r>
         <w:t xml:space="preserve">Contents</w:t>
       </w:r>
     </w:p>
     <w:p>
       <w:r>
-        <w:t xml:space="preserve">We will be adding new chapters when they are ready. Please check back regularly!</w:t>
+        <w:t xml:space="preserve">We will add new chapters as they become ready. Please check back regularly!</w:t>
       </w:r>
     </w:p>
     <w:p>
@@ -191,7 +179,14 @@
         </w:numPr>
       </w:pPr>
       <w:r>
-        <w:t xml:space="preserve">Introduction. This chapter. </w:t>
+        <w:rPr>
+          <w:b/>
+          <w:bCs/>
+        </w:rPr>
+        <w:t xml:space="preserve">Introduction</w:t>
+      </w:r>
+      <w:r>
+        <w:t xml:space="preserve">. This chapter. </w:t>
       </w:r>
     </w:p>
     <w:p>
@@ -203,8 +198,15 @@
         </w:numPr>
       </w:pPr>
       <w:r>
+        <w:rPr>
+          <w:b/>
+          <w:bCs/>
+        </w:rPr>
         <w:br/>
-        <w:t xml:space="preserve">Program Design. How to create a program or strategy for your organization/business.</w:t>
+        <w:t xml:space="preserve">Program Design</w:t>
+      </w:r>
+      <w:r>
+        <w:t xml:space="preserve">. How to create a program or strategy for your organization/business.</w:t>
       </w:r>
     </w:p>
     <w:p>
@@ -216,8 +218,15 @@
         </w:numPr>
       </w:pPr>
       <w:r>
+        <w:rPr>
+          <w:b/>
+          <w:bCs/>
+        </w:rPr>
         <w:br/>
-        <w:t xml:space="preserve">Proposals. A startup guide for project design and writing proposals.</w:t>
+        <w:t xml:space="preserve">Proposals</w:t>
+      </w:r>
+      <w:r>
+        <w:t xml:space="preserve">. A startup guide for project design and writing proposals.</w:t>
       </w:r>
     </w:p>
     <w:p>
@@ -229,8 +238,15 @@
         </w:numPr>
       </w:pPr>
       <w:r>
+        <w:rPr>
+          <w:b/>
+          <w:bCs/>
+        </w:rPr>
         <w:br/>
-        <w:t xml:space="preserve">Monitoring. Monitoring and evaluation of your program and projects. Testing assumptions inherent in your theory of change.</w:t>
+        <w:t xml:space="preserve">Monitoring</w:t>
+      </w:r>
+      <w:r>
+        <w:t xml:space="preserve">. Monitoring and evaluation of your program and projects. Testing assumptions inherent in your theory of change.</w:t>
       </w:r>
     </w:p>
     <w:p>
@@ -242,8 +258,15 @@
         </w:numPr>
       </w:pPr>
       <w:r>
+        <w:rPr>
+          <w:b/>
+          <w:bCs/>
+        </w:rPr>
         <w:br/>
-        <w:t xml:space="preserve">eCivis. Managing your application and project using eCivis.</w:t>
+        <w:t xml:space="preserve">eCivis</w:t>
+      </w:r>
+      <w:r>
+        <w:t xml:space="preserve">. Managing your application and project using eCivis.</w:t>
       </w:r>
     </w:p>
     <w:p>
@@ -255,8 +278,15 @@
         </w:numPr>
       </w:pPr>
       <w:r>
+        <w:rPr>
+          <w:b/>
+          <w:bCs/>
+        </w:rPr>
         <w:br/>
-        <w:t xml:space="preserve">Compliance Pathways. Overview of the California Environmental Quality Act and its application to forest-based business/organization projects.</w:t>
+        <w:t xml:space="preserve">Compliance Pathways</w:t>
+      </w:r>
+      <w:r>
+        <w:t xml:space="preserve">. Overview of the California Environmental Quality Act and its application to forest-based business/organization projects.</w:t>
       </w:r>
     </w:p>
     <w:p>
@@ -268,8 +298,15 @@
         </w:numPr>
       </w:pPr>
       <w:r>
+        <w:rPr>
+          <w:b/>
+          <w:bCs/>
+        </w:rPr>
         <w:br/>
-        <w:t xml:space="preserve">Resilience Gap. An analysis by New Leaf Climate Partners examining fuel reduction needs to decrease risks of severe wildfire for private forest owners in low-income communities in California.</w:t>
+        <w:t xml:space="preserve">Resilience Gap</w:t>
+      </w:r>
+      <w:r>
+        <w:t xml:space="preserve">. An analysis by New Leaf Climate Partners examining fuel reduction needs to decrease risks of severe wildfire for private forest owners in low-income communities in California.</w:t>
       </w:r>
     </w:p>
     <w:p>
@@ -281,8 +318,15 @@
         </w:numPr>
       </w:pPr>
       <w:r>
+        <w:rPr>
+          <w:b/>
+          <w:bCs/>
+        </w:rPr>
         <w:br/>
-        <w:t xml:space="preserve">Funding Analysis. Examines funding distribution for the CAL FIRE Business and Workforce Development Grants Program.</w:t>
+        <w:t xml:space="preserve">Funding Analysis</w:t>
+      </w:r>
+      <w:r>
+        <w:t xml:space="preserve">. Examines funding distribution for the CAL FIRE Business and Workforce Development Grants Program.</w:t>
       </w:r>
     </w:p>
     <w:p>
@@ -294,8 +338,15 @@
         </w:numPr>
       </w:pPr>
       <w:r>
+        <w:rPr>
+          <w:b/>
+          <w:bCs/>
+        </w:rPr>
         <w:br/>
-        <w:t xml:space="preserve">Scaling. Scaling forest business and organizational reach and impact.</w:t>
+        <w:t xml:space="preserve">Scaling</w:t>
+      </w:r>
+      <w:r>
+        <w:t xml:space="preserve">. Scaling forest business and organizational reach and impact.</w:t>
       </w:r>
     </w:p>
     <w:p>
@@ -307,8 +358,15 @@
         </w:numPr>
       </w:pPr>
       <w:r>
+        <w:rPr>
+          <w:b/>
+          <w:bCs/>
+        </w:rPr>
         <w:br/>
-        <w:t xml:space="preserve">Grant Management. Now that you have a grant how do you successfully manage it?</w:t>
+        <w:t xml:space="preserve">Grant Management</w:t>
+      </w:r>
+      <w:r>
+        <w:t xml:space="preserve">. Now that you have a grant, how do you successfully manage it?</w:t>
       </w:r>
     </w:p>
     <w:p>
@@ -320,8 +378,53 @@
         </w:numPr>
       </w:pPr>
       <w:r>
+        <w:rPr>
+          <w:b/>
+          <w:bCs/>
+        </w:rPr>
         <w:br/>
-        <w:t xml:space="preserve">Cases. [coming soon!] Case studies of successful business and workforce development in California’s forest health sector.</w:t>
+        <w:t xml:space="preserve">Startup pathways</w:t>
+      </w:r>
+      <w:r>
+        <w:t xml:space="preserve">. Coming Soon. Lessons and approaches for new businesses negotiating the challenges posed by startup.</w:t>
+      </w:r>
+    </w:p>
+    <w:p>
+      <w:pPr>
+        <w:pStyle w:val="ListParagraph"/>
+        <w:numPr>
+          <w:ilvl w:val="0"/>
+          <w:numId w:val="5"/>
+        </w:numPr>
+      </w:pPr>
+      <w:r>
+        <w:rPr>
+          <w:b/>
+          <w:bCs/>
+        </w:rPr>
+        <w:t xml:space="preserve">Cases</w:t>
+      </w:r>
+      <w:r>
+        <w:t xml:space="preserve">. Case studies of successful business and workforce development in California’s forest health sector. The first case featured the Washoe Tribe’s Elder, Share &amp; Sale Firewood Program followed by Plumas Wood Fiber and Forestree Collective. More to come soon.</w:t>
+      </w:r>
+    </w:p>
+    <w:p>
+      <w:pPr>
+        <w:pStyle w:val="ListParagraph"/>
+        <w:numPr>
+          <w:ilvl w:val="0"/>
+          <w:numId w:val="5"/>
+        </w:numPr>
+      </w:pPr>
+      <w:r>
+        <w:rPr>
+          <w:b/>
+          <w:bCs/>
+        </w:rPr>
+        <w:t xml:space="preserve">Grant Closeout</w:t>
+      </w:r>
+      <w:r>
+        <w:t xml:space="preserve">. How to leverage and learn from closing out your grant.</w:t>
       </w:r>
     </w:p>
     <w:sectPr>

</xml_diff>

<commit_message>
Review charts update new docx build
</commit_message>
<xml_diff>
--- a/chapters/exports/01-intro.docx
+++ b/chapters/exports/01-intro.docx
@@ -30,7 +30,7 @@
       <w:r>
         <w:t xml:space="preserve">The </w:t>
       </w:r>
-      <w:hyperlink w:history="1" r:id="rIdrx7xqxpbgxmboizi717lo">
+      <w:hyperlink w:history="1" r:id="rIdnbjvucqansd20tou7lvbd">
         <w:r>
           <w:rPr>
             <w:rStyle w:val="Hyperlink"/>
@@ -54,7 +54,7 @@
       <w:r>
         <w:t xml:space="preserve">Funding for the Forest Business Alliance is provided by the </w:t>
       </w:r>
-      <w:hyperlink w:history="1" r:id="rIdll5g4vxyooqmstwcs2sa-">
+      <w:hyperlink w:history="1" r:id="rIdismq2uflb1g76tkaudmdh">
         <w:r>
           <w:rPr>
             <w:rStyle w:val="Hyperlink"/>
@@ -65,7 +65,7 @@
       <w:r>
         <w:t xml:space="preserve">. Past funders include the </w:t>
       </w:r>
-      <w:hyperlink w:history="1" r:id="rIdnb_ysltewezwk1wtzdtre">
+      <w:hyperlink w:history="1" r:id="rIdhuxelbuoetkul1kyeqd6o">
         <w:r>
           <w:rPr>
             <w:rStyle w:val="Hyperlink"/>
@@ -134,7 +134,7 @@
       <w:r>
         <w:t xml:space="preserve">Businesses, Tribal organizations, nonprofits, and other entities are creating sustainable wood product facilities and businesses. The guide provides key insights and advice on accessing funds. More information and templates for the CAL FIRE Business and Workforce Development and USDA Forest Service Wood Innovation Grants can be found at the </w:t>
       </w:r>
-      <w:hyperlink w:history="1" r:id="rIdc008nbi1hyio8kyei91um">
+      <w:hyperlink w:history="1" r:id="rIdxsohtbuyqwo4zbsgl1lkf">
         <w:r>
           <w:rPr>
             <w:rStyle w:val="Hyperlink"/>
@@ -145,7 +145,7 @@
       <w:r>
         <w:t xml:space="preserve"> website. Feedback is welcome. Contact us directly at </w:t>
       </w:r>
-      <w:hyperlink w:history="1" r:id="rIdm6si9y8xrbkbvyxbvyaw7">
+      <w:hyperlink w:history="1" r:id="rIduwtmpjuikbiox1ifu07ur">
         <w:r>
           <w:rPr>
             <w:rStyle w:val="Hyperlink"/>

</xml_diff>

<commit_message>
next steps chp 14
</commit_message>
<xml_diff>
--- a/chapters/exports/01-intro.docx
+++ b/chapters/exports/01-intro.docx
@@ -30,7 +30,7 @@
       <w:r>
         <w:t xml:space="preserve">The </w:t>
       </w:r>
-      <w:hyperlink w:history="1" r:id="rIdnbjvucqansd20tou7lvbd">
+      <w:hyperlink w:history="1" r:id="rIdjktz1bztdha6q05ekelbq">
         <w:r>
           <w:rPr>
             <w:rStyle w:val="Hyperlink"/>
@@ -54,7 +54,7 @@
       <w:r>
         <w:t xml:space="preserve">Funding for the Forest Business Alliance is provided by the </w:t>
       </w:r>
-      <w:hyperlink w:history="1" r:id="rIdismq2uflb1g76tkaudmdh">
+      <w:hyperlink w:history="1" r:id="rIdidy6spu3tm8naqnkkmm7s">
         <w:r>
           <w:rPr>
             <w:rStyle w:val="Hyperlink"/>
@@ -65,7 +65,7 @@
       <w:r>
         <w:t xml:space="preserve">. Past funders include the </w:t>
       </w:r>
-      <w:hyperlink w:history="1" r:id="rIdhuxelbuoetkul1kyeqd6o">
+      <w:hyperlink w:history="1" r:id="rIdqv86dnkkicimzfxnfuxrc">
         <w:r>
           <w:rPr>
             <w:rStyle w:val="Hyperlink"/>
@@ -134,7 +134,7 @@
       <w:r>
         <w:t xml:space="preserve">Businesses, Tribal organizations, nonprofits, and other entities are creating sustainable wood product facilities and businesses. The guide provides key insights and advice on accessing funds. More information and templates for the CAL FIRE Business and Workforce Development and USDA Forest Service Wood Innovation Grants can be found at the </w:t>
       </w:r>
-      <w:hyperlink w:history="1" r:id="rIdxsohtbuyqwo4zbsgl1lkf">
+      <w:hyperlink w:history="1" r:id="rIdudf54zozhcyje4z7phjui">
         <w:r>
           <w:rPr>
             <w:rStyle w:val="Hyperlink"/>
@@ -145,7 +145,7 @@
       <w:r>
         <w:t xml:space="preserve"> website. Feedback is welcome. Contact us directly at </w:t>
       </w:r>
-      <w:hyperlink w:history="1" r:id="rIduwtmpjuikbiox1ifu07ur">
+      <w:hyperlink w:history="1" r:id="rIdlkcp3oi_ls-ov7lmmtfe8">
         <w:r>
           <w:rPr>
             <w:rStyle w:val="Hyperlink"/>

</xml_diff>

<commit_message>
intro chp update & docx build
</commit_message>
<xml_diff>
--- a/chapters/exports/01-intro.docx
+++ b/chapters/exports/01-intro.docx
@@ -30,7 +30,7 @@
       <w:r>
         <w:t xml:space="preserve">The </w:t>
       </w:r>
-      <w:hyperlink w:history="1" r:id="rIdjktz1bztdha6q05ekelbq">
+      <w:hyperlink w:history="1" r:id="rId6elymflvycs1y-1obwl5z">
         <w:r>
           <w:rPr>
             <w:rStyle w:val="Hyperlink"/>
@@ -54,7 +54,7 @@
       <w:r>
         <w:t xml:space="preserve">Funding for the Forest Business Alliance is provided by the </w:t>
       </w:r>
-      <w:hyperlink w:history="1" r:id="rIdidy6spu3tm8naqnkkmm7s">
+      <w:hyperlink w:history="1" r:id="rIddyd3yzizzxx7u_bx3w1ru">
         <w:r>
           <w:rPr>
             <w:rStyle w:val="Hyperlink"/>
@@ -65,7 +65,7 @@
       <w:r>
         <w:t xml:space="preserve">. Past funders include the </w:t>
       </w:r>
-      <w:hyperlink w:history="1" r:id="rIdqv86dnkkicimzfxnfuxrc">
+      <w:hyperlink w:history="1" r:id="rIdstlmnzgh4jvcepbfxzood">
         <w:r>
           <w:rPr>
             <w:rStyle w:val="Hyperlink"/>
@@ -134,7 +134,7 @@
       <w:r>
         <w:t xml:space="preserve">Businesses, Tribal organizations, nonprofits, and other entities are creating sustainable wood product facilities and businesses. The guide provides key insights and advice on accessing funds. More information and templates for the CAL FIRE Business and Workforce Development and USDA Forest Service Wood Innovation Grants can be found at the </w:t>
       </w:r>
-      <w:hyperlink w:history="1" r:id="rIdudf54zozhcyje4z7phjui">
+      <w:hyperlink w:history="1" r:id="rIdh-tzu5qoba1xnoa4pj4av">
         <w:r>
           <w:rPr>
             <w:rStyle w:val="Hyperlink"/>
@@ -145,7 +145,7 @@
       <w:r>
         <w:t xml:space="preserve"> website. Feedback is welcome. Contact us directly at </w:t>
       </w:r>
-      <w:hyperlink w:history="1" r:id="rIdlkcp3oi_ls-ov7lmmtfe8">
+      <w:hyperlink w:history="1" r:id="rId-nlyb2eupfcuxowrsxksq">
         <w:r>
           <w:rPr>
             <w:rStyle w:val="Hyperlink"/>
@@ -425,6 +425,25 @@
       </w:r>
       <w:r>
         <w:t xml:space="preserve">. How to leverage and learn from closing out your grant.</w:t>
+      </w:r>
+    </w:p>
+    <w:p>
+      <w:pPr>
+        <w:pStyle w:val="ListParagraph"/>
+        <w:numPr>
+          <w:ilvl w:val="0"/>
+          <w:numId w:val="212"/>
+        </w:numPr>
+      </w:pPr>
+      <w:r>
+        <w:rPr>
+          <w:b/>
+          <w:bCs/>
+        </w:rPr>
+        <w:t xml:space="preserve">FBA Review</w:t>
+      </w:r>
+      <w:r>
+        <w:t xml:space="preserve">. Review of FBA Phase I with recommendations for future work.</w:t>
       </w:r>
     </w:p>
     <w:sectPr>

</xml_diff>

<commit_message>
grant management update for autorpt
</commit_message>
<xml_diff>
--- a/chapters/exports/01-intro.docx
+++ b/chapters/exports/01-intro.docx
@@ -30,7 +30,7 @@
       <w:r>
         <w:t xml:space="preserve">The </w:t>
       </w:r>
-      <w:hyperlink w:history="1" r:id="rId6elymflvycs1y-1obwl5z">
+      <w:hyperlink w:history="1" r:id="rIdbsv5u96pys_w9vurd9ttw">
         <w:r>
           <w:rPr>
             <w:rStyle w:val="Hyperlink"/>
@@ -54,7 +54,7 @@
       <w:r>
         <w:t xml:space="preserve">Funding for the Forest Business Alliance is provided by the </w:t>
       </w:r>
-      <w:hyperlink w:history="1" r:id="rIddyd3yzizzxx7u_bx3w1ru">
+      <w:hyperlink w:history="1" r:id="rIdu_joyfmiglf3vwshxgejr">
         <w:r>
           <w:rPr>
             <w:rStyle w:val="Hyperlink"/>
@@ -65,7 +65,7 @@
       <w:r>
         <w:t xml:space="preserve">. Past funders include the </w:t>
       </w:r>
-      <w:hyperlink w:history="1" r:id="rIdstlmnzgh4jvcepbfxzood">
+      <w:hyperlink w:history="1" r:id="rIdfx5jsmlknksexnzccasom">
         <w:r>
           <w:rPr>
             <w:rStyle w:val="Hyperlink"/>
@@ -86,7 +86,7 @@
           <wp:inline distT="0" distB="0" distL="0" distR="0">
             <wp:extent cx="4000500" cy="5173980"/>
             <wp:effectExtent b="0" l="0" r="0" t="0"/>
-            <wp:docPr id="208" name="" descr="" title=""/>
+            <wp:docPr id="211" name="" descr="" title=""/>
             <wp:cNvGraphicFramePr>
               <a:graphicFrameLocks xmlns:a="http://schemas.openxmlformats.org/drawingml/2006/main" noChangeAspect="1"/>
             </wp:cNvGraphicFramePr>
@@ -134,7 +134,7 @@
       <w:r>
         <w:t xml:space="preserve">Businesses, Tribal organizations, nonprofits, and other entities are creating sustainable wood product facilities and businesses. The guide provides key insights and advice on accessing funds. More information and templates for the CAL FIRE Business and Workforce Development and USDA Forest Service Wood Innovation Grants can be found at the </w:t>
       </w:r>
-      <w:hyperlink w:history="1" r:id="rIdh-tzu5qoba1xnoa4pj4av">
+      <w:hyperlink w:history="1" r:id="rId-i18batxwffgh4sfhdlle">
         <w:r>
           <w:rPr>
             <w:rStyle w:val="Hyperlink"/>
@@ -145,7 +145,7 @@
       <w:r>
         <w:t xml:space="preserve"> website. Feedback is welcome. Contact us directly at </w:t>
       </w:r>
-      <w:hyperlink w:history="1" r:id="rId-nlyb2eupfcuxowrsxksq">
+      <w:hyperlink w:history="1" r:id="rIduypshcvxyoyb6rcsw-vli">
         <w:r>
           <w:rPr>
             <w:rStyle w:val="Hyperlink"/>
@@ -175,7 +175,7 @@
         <w:pStyle w:val="ListParagraph"/>
         <w:numPr>
           <w:ilvl w:val="0"/>
-          <w:numId w:val="212"/>
+          <w:numId w:val="215"/>
         </w:numPr>
       </w:pPr>
       <w:r>
@@ -194,7 +194,7 @@
         <w:pStyle w:val="ListParagraph"/>
         <w:numPr>
           <w:ilvl w:val="0"/>
-          <w:numId w:val="212"/>
+          <w:numId w:val="215"/>
         </w:numPr>
       </w:pPr>
       <w:r>
@@ -214,7 +214,7 @@
         <w:pStyle w:val="ListParagraph"/>
         <w:numPr>
           <w:ilvl w:val="0"/>
-          <w:numId w:val="212"/>
+          <w:numId w:val="215"/>
         </w:numPr>
       </w:pPr>
       <w:r>
@@ -234,7 +234,7 @@
         <w:pStyle w:val="ListParagraph"/>
         <w:numPr>
           <w:ilvl w:val="0"/>
-          <w:numId w:val="212"/>
+          <w:numId w:val="215"/>
         </w:numPr>
       </w:pPr>
       <w:r>
@@ -254,7 +254,7 @@
         <w:pStyle w:val="ListParagraph"/>
         <w:numPr>
           <w:ilvl w:val="0"/>
-          <w:numId w:val="212"/>
+          <w:numId w:val="215"/>
         </w:numPr>
       </w:pPr>
       <w:r>
@@ -274,7 +274,7 @@
         <w:pStyle w:val="ListParagraph"/>
         <w:numPr>
           <w:ilvl w:val="0"/>
-          <w:numId w:val="212"/>
+          <w:numId w:val="215"/>
         </w:numPr>
       </w:pPr>
       <w:r>
@@ -294,7 +294,7 @@
         <w:pStyle w:val="ListParagraph"/>
         <w:numPr>
           <w:ilvl w:val="0"/>
-          <w:numId w:val="212"/>
+          <w:numId w:val="215"/>
         </w:numPr>
       </w:pPr>
       <w:r>
@@ -314,7 +314,7 @@
         <w:pStyle w:val="ListParagraph"/>
         <w:numPr>
           <w:ilvl w:val="0"/>
-          <w:numId w:val="212"/>
+          <w:numId w:val="215"/>
         </w:numPr>
       </w:pPr>
       <w:r>
@@ -334,7 +334,7 @@
         <w:pStyle w:val="ListParagraph"/>
         <w:numPr>
           <w:ilvl w:val="0"/>
-          <w:numId w:val="212"/>
+          <w:numId w:val="215"/>
         </w:numPr>
       </w:pPr>
       <w:r>
@@ -354,7 +354,7 @@
         <w:pStyle w:val="ListParagraph"/>
         <w:numPr>
           <w:ilvl w:val="0"/>
-          <w:numId w:val="212"/>
+          <w:numId w:val="215"/>
         </w:numPr>
       </w:pPr>
       <w:r>
@@ -374,7 +374,7 @@
         <w:pStyle w:val="ListParagraph"/>
         <w:numPr>
           <w:ilvl w:val="0"/>
-          <w:numId w:val="212"/>
+          <w:numId w:val="215"/>
         </w:numPr>
       </w:pPr>
       <w:r>
@@ -394,7 +394,7 @@
         <w:pStyle w:val="ListParagraph"/>
         <w:numPr>
           <w:ilvl w:val="0"/>
-          <w:numId w:val="212"/>
+          <w:numId w:val="215"/>
         </w:numPr>
       </w:pPr>
       <w:r>
@@ -413,7 +413,7 @@
         <w:pStyle w:val="ListParagraph"/>
         <w:numPr>
           <w:ilvl w:val="0"/>
-          <w:numId w:val="212"/>
+          <w:numId w:val="215"/>
         </w:numPr>
       </w:pPr>
       <w:r>
@@ -432,7 +432,7 @@
         <w:pStyle w:val="ListParagraph"/>
         <w:numPr>
           <w:ilvl w:val="0"/>
-          <w:numId w:val="212"/>
+          <w:numId w:val="215"/>
         </w:numPr>
       </w:pPr>
       <w:r>
@@ -444,6 +444,22 @@
       </w:r>
       <w:r>
         <w:t xml:space="preserve">. Review of FBA Phase I with recommendations for future work.</w:t>
+      </w:r>
+    </w:p>
+    <w:p>
+      <w:r>
+        <w:t xml:space="preserve">Downloads in markdown, MS Word, and pdf are available for each chapter by clicking the download icon in the upper right corner of each document and selecting the format you want. If you want to download the entire book in pdf, go to the fba-guide.pdf </w:t>
+      </w:r>
+      <w:hyperlink w:history="1" r:id="rId-xoe1a-mzi_pfd__isayu">
+        <w:r>
+          <w:rPr>
+            <w:rStyle w:val="Hyperlink"/>
+          </w:rPr>
+          <w:t xml:space="preserve">file</w:t>
+        </w:r>
+      </w:hyperlink>
+      <w:r>
+        <w:t xml:space="preserve"> in the Github repository then click download download raw file icon in the upper right above the pdf document.</w:t>
       </w:r>
     </w:p>
     <w:sectPr>
@@ -476,7 +492,7 @@
         <wp:inline distT="0" distB="0" distL="0" distR="0">
           <wp:extent cx="608542" cy="105833"/>
           <wp:effectExtent b="0" l="0" r="0" t="0"/>
-          <wp:docPr id="209" name="" descr="" title=""/>
+          <wp:docPr id="212" name="" descr="" title=""/>
           <wp:cNvGraphicFramePr>
             <a:graphicFrameLocks xmlns:a="http://schemas.openxmlformats.org/drawingml/2006/main" noChangeAspect="1"/>
           </wp:cNvGraphicFramePr>
@@ -554,7 +570,7 @@
 
 <file path=word/numbering.xml><?xml version="1.0" encoding="utf-8"?>
 <w:numbering xmlns:wpc="http://schemas.microsoft.com/office/word/2010/wordprocessingCanvas" xmlns:mc="http://schemas.openxmlformats.org/markup-compatibility/2006" xmlns:o="urn:schemas-microsoft-com:office:office" xmlns:r="http://schemas.openxmlformats.org/officeDocument/2006/relationships" xmlns:m="http://schemas.openxmlformats.org/officeDocument/2006/math" xmlns:v="urn:schemas-microsoft-com:vml" xmlns:wp14="http://schemas.microsoft.com/office/word/2010/wordprocessingDrawing" xmlns:wp="http://schemas.openxmlformats.org/drawingml/2006/wordprocessingDrawing" xmlns:w10="urn:schemas-microsoft-com:office:word" xmlns:w="http://schemas.openxmlformats.org/wordprocessingml/2006/main" xmlns:w14="http://schemas.microsoft.com/office/word/2010/wordml" xmlns:w15="http://schemas.microsoft.com/office/word/2012/wordml" xmlns:wpg="http://schemas.microsoft.com/office/word/2010/wordprocessingGroup" xmlns:wpi="http://schemas.microsoft.com/office/word/2010/wordprocessingInk" xmlns:wne="http://schemas.microsoft.com/office/word/2006/wordml" xmlns:wps="http://schemas.microsoft.com/office/word/2010/wordprocessingShape" mc:Ignorable="w14 w15 wp14">
-  <w:abstractNum w:abstractNumId="210" w15:restartNumberingAfterBreak="0">
+  <w:abstractNum w:abstractNumId="213" w15:restartNumberingAfterBreak="0">
     <w:multiLevelType w:val="hybridMultilevel"/>
     <w:lvl w:ilvl="0" w15:tentative="1">
       <w:start w:val="1"/>
@@ -638,7 +654,7 @@
       </w:pPr>
     </w:lvl>
   </w:abstractNum>
-  <w:abstractNum w:abstractNumId="211" w15:restartNumberingAfterBreak="0">
+  <w:abstractNum w:abstractNumId="214" w15:restartNumberingAfterBreak="0">
     <w:multiLevelType w:val="hybridMultilevel"/>
     <w:lvl w:ilvl="0" w15:tentative="1">
       <w:start w:val="1"/>
@@ -723,13 +739,13 @@
     </w:lvl>
   </w:abstractNum>
   <w:num w:numId="1">
-    <w:abstractNumId w:val="210"/>
+    <w:abstractNumId w:val="213"/>
     <w:lvlOverride w:ilvl="0">
       <w:startOverride w:val="1"/>
     </w:lvlOverride>
   </w:num>
-  <w:num w:numId="212">
-    <w:abstractNumId w:val="211"/>
+  <w:num w:numId="215">
+    <w:abstractNumId w:val="214"/>
     <w:lvlOverride w:ilvl="0">
       <w:startOverride w:val="1"/>
     </w:lvlOverride>

</xml_diff>

<commit_message>
updated pictures, admonitions and general edit
</commit_message>
<xml_diff>
--- a/chapters/exports/01-intro.docx
+++ b/chapters/exports/01-intro.docx
@@ -30,7 +30,7 @@
       <w:r>
         <w:t xml:space="preserve">The </w:t>
       </w:r>
-      <w:hyperlink w:history="1" r:id="rIdydqq6n8bzfun8h33ko1hx">
+      <w:hyperlink w:history="1" r:id="rIdqftes3no3t9szmuyvlcp9">
         <w:r>
           <w:rPr>
             <w:rStyle w:val="Hyperlink"/>
@@ -54,7 +54,7 @@
       <w:r>
         <w:t xml:space="preserve">Funding for the Forest Business Alliance is provided by the </w:t>
       </w:r>
-      <w:hyperlink w:history="1" r:id="rIdgfojsxrhshd11fu6hvmge">
+      <w:hyperlink w:history="1" r:id="rIdcffuor_sav5pnw2yq4rhc">
         <w:r>
           <w:rPr>
             <w:rStyle w:val="Hyperlink"/>
@@ -65,7 +65,7 @@
       <w:r>
         <w:t xml:space="preserve">. Past funders include the </w:t>
       </w:r>
-      <w:hyperlink w:history="1" r:id="rIdztqsirtp7wljr98sj9az3">
+      <w:hyperlink w:history="1" r:id="rIdvcjdsh-d2ij01pbohzyhg">
         <w:r>
           <w:rPr>
             <w:rStyle w:val="Hyperlink"/>
@@ -74,7 +74,7 @@
         </w:r>
       </w:hyperlink>
       <w:r>
-        <w:t xml:space="preserve"> and USDA Forest Service.</w:t>
+        <w:t xml:space="preserve"> and the USDA Forest Service.</w:t>
       </w:r>
     </w:p>
     <w:p>
@@ -86,7 +86,7 @@
           <wp:inline distT="0" distB="0" distL="0" distR="0">
             <wp:extent cx="4000500" cy="5173980"/>
             <wp:effectExtent b="0" l="0" r="0" t="0"/>
-            <wp:docPr id="207" name="" descr="" title=""/>
+            <wp:docPr id="236" name="" descr="" title=""/>
             <wp:cNvGraphicFramePr>
               <a:graphicFrameLocks xmlns:a="http://schemas.openxmlformats.org/drawingml/2006/main" noChangeAspect="1"/>
             </wp:cNvGraphicFramePr>
@@ -132,9 +132,9 @@
     </w:p>
     <w:p>
       <w:r>
-        <w:t xml:space="preserve">Businesses, Tribal organizations, nonprofits, and other entities are creating sustainable wood product facilities and businesses. The guide provides key insights and advice on accessing funds. More information and templates for the CAL FIRE Business and Workforce Development and USDA Forest Service Wood Innovation Grants can be found at the </w:t>
-      </w:r>
-      <w:hyperlink w:history="1" r:id="rIddknhotv4ifnjaqtqjp913">
+        <w:t xml:space="preserve">Businesses, Tribal organizations, nonprofits, and other entities are creating sustainable wood product facilities and businesses. The guide provides key insights and advice on accessing funds. More information and templates for the CAL FIRE Business and Workforce Development and USDA Forest Service Wood Innovation Grants are available on the </w:t>
+      </w:r>
+      <w:hyperlink w:history="1" r:id="rIdcpdibkrnbayuqkeguvd6x">
         <w:r>
           <w:rPr>
             <w:rStyle w:val="Hyperlink"/>
@@ -145,7 +145,7 @@
       <w:r>
         <w:t xml:space="preserve"> website. Feedback is welcome. Contact us directly at </w:t>
       </w:r>
-      <w:hyperlink w:history="1" r:id="rId8fpv60rkihakmi2k2tm96">
+      <w:hyperlink w:history="1" r:id="rIdu-zlkbpiofmrenpogqf_p">
         <w:r>
           <w:rPr>
             <w:rStyle w:val="Hyperlink"/>
@@ -175,7 +175,7 @@
         <w:pStyle w:val="ListParagraph"/>
         <w:numPr>
           <w:ilvl w:val="0"/>
-          <w:numId w:val="211"/>
+          <w:numId w:val="240"/>
         </w:numPr>
       </w:pPr>
       <w:r>
@@ -194,7 +194,7 @@
         <w:pStyle w:val="ListParagraph"/>
         <w:numPr>
           <w:ilvl w:val="0"/>
-          <w:numId w:val="211"/>
+          <w:numId w:val="240"/>
         </w:numPr>
       </w:pPr>
       <w:r>
@@ -214,7 +214,7 @@
         <w:pStyle w:val="ListParagraph"/>
         <w:numPr>
           <w:ilvl w:val="0"/>
-          <w:numId w:val="211"/>
+          <w:numId w:val="240"/>
         </w:numPr>
       </w:pPr>
       <w:r>
@@ -234,7 +234,7 @@
         <w:pStyle w:val="ListParagraph"/>
         <w:numPr>
           <w:ilvl w:val="0"/>
-          <w:numId w:val="211"/>
+          <w:numId w:val="240"/>
         </w:numPr>
       </w:pPr>
       <w:r>
@@ -254,7 +254,7 @@
         <w:pStyle w:val="ListParagraph"/>
         <w:numPr>
           <w:ilvl w:val="0"/>
-          <w:numId w:val="211"/>
+          <w:numId w:val="240"/>
         </w:numPr>
       </w:pPr>
       <w:r>
@@ -274,7 +274,7 @@
         <w:pStyle w:val="ListParagraph"/>
         <w:numPr>
           <w:ilvl w:val="0"/>
-          <w:numId w:val="211"/>
+          <w:numId w:val="240"/>
         </w:numPr>
       </w:pPr>
       <w:r>
@@ -294,7 +294,7 @@
         <w:pStyle w:val="ListParagraph"/>
         <w:numPr>
           <w:ilvl w:val="0"/>
-          <w:numId w:val="211"/>
+          <w:numId w:val="240"/>
         </w:numPr>
       </w:pPr>
       <w:r>
@@ -314,7 +314,7 @@
         <w:pStyle w:val="ListParagraph"/>
         <w:numPr>
           <w:ilvl w:val="0"/>
-          <w:numId w:val="211"/>
+          <w:numId w:val="240"/>
         </w:numPr>
       </w:pPr>
       <w:r>
@@ -334,7 +334,7 @@
         <w:pStyle w:val="ListParagraph"/>
         <w:numPr>
           <w:ilvl w:val="0"/>
-          <w:numId w:val="211"/>
+          <w:numId w:val="240"/>
         </w:numPr>
       </w:pPr>
       <w:r>
@@ -354,7 +354,7 @@
         <w:pStyle w:val="ListParagraph"/>
         <w:numPr>
           <w:ilvl w:val="0"/>
-          <w:numId w:val="211"/>
+          <w:numId w:val="240"/>
         </w:numPr>
       </w:pPr>
       <w:r>
@@ -366,7 +366,7 @@
         <w:t xml:space="preserve">Grant Management</w:t>
       </w:r>
       <w:r>
-        <w:t xml:space="preserve">. Now that you have a grant, how do you successfully manage it?</w:t>
+        <w:t xml:space="preserve">. Now that you have a grant, how do you manage it successfully?</w:t>
       </w:r>
     </w:p>
     <w:p>
@@ -374,7 +374,7 @@
         <w:pStyle w:val="ListParagraph"/>
         <w:numPr>
           <w:ilvl w:val="0"/>
-          <w:numId w:val="211"/>
+          <w:numId w:val="240"/>
         </w:numPr>
       </w:pPr>
       <w:r>
@@ -386,7 +386,7 @@
         <w:t xml:space="preserve">Startup pathways</w:t>
       </w:r>
       <w:r>
-        <w:t xml:space="preserve">. Coming Soon. Lessons and approaches for new businesses negotiating the challenges posed by startup.</w:t>
+        <w:t xml:space="preserve">. Coming Soon. Lessons and approaches for new businesses navigating the challenges of starting up.</w:t>
       </w:r>
     </w:p>
     <w:p>
@@ -394,7 +394,7 @@
         <w:pStyle w:val="ListParagraph"/>
         <w:numPr>
           <w:ilvl w:val="0"/>
-          <w:numId w:val="211"/>
+          <w:numId w:val="240"/>
         </w:numPr>
       </w:pPr>
       <w:r>
@@ -405,7 +405,7 @@
         <w:t xml:space="preserve">Cases</w:t>
       </w:r>
       <w:r>
-        <w:t xml:space="preserve">. Case studies of successful business and workforce development in California’s forest health sector. The first case featured the Washoe Tribe’s Elder, Share &amp; Sale Firewood Program followed by Plumas Wood Fiber and Forestree Collective. More to come soon.</w:t>
+        <w:t xml:space="preserve">. Case studies of successful business and workforce development in California’s forest health sector. The first case featured the Washoe Tribe’s Elder, Share &amp; Sale Firewood Program, followed by Plumas Wood Fiber and Forestree Collective. More to come soon.</w:t>
       </w:r>
     </w:p>
     <w:p>
@@ -413,7 +413,7 @@
         <w:pStyle w:val="ListParagraph"/>
         <w:numPr>
           <w:ilvl w:val="0"/>
-          <w:numId w:val="211"/>
+          <w:numId w:val="240"/>
         </w:numPr>
       </w:pPr>
       <w:r>
@@ -432,7 +432,7 @@
         <w:pStyle w:val="ListParagraph"/>
         <w:numPr>
           <w:ilvl w:val="0"/>
-          <w:numId w:val="211"/>
+          <w:numId w:val="240"/>
         </w:numPr>
       </w:pPr>
       <w:r>
@@ -448,9 +448,9 @@
     </w:p>
     <w:p>
       <w:r>
-        <w:t xml:space="preserve">Downloads in markdown, MS Word, and pdf are available for each chapter by clicking the download icon in the upper right corner of each document and selecting the format you want. To download the entire book in pdf, go to the fba-guide.pdf </w:t>
-      </w:r>
-      <w:hyperlink w:history="1" r:id="rIdz3d2fni4ddfffgtdmmwvw">
+        <w:t xml:space="preserve">Downloads in markdown, MS Word, and pdf are available for each chapter by clicking the download icon in the upper right corner of each document and selecting the format you want. To download the entire book in PDF, go to the fba-guide.pdf </w:t>
+      </w:r>
+      <w:hyperlink w:history="1" r:id="rIdccpl2q78zfbs0dc8yfrxs">
         <w:r>
           <w:rPr>
             <w:rStyle w:val="Hyperlink"/>
@@ -459,7 +459,7 @@
         </w:r>
       </w:hyperlink>
       <w:r>
-        <w:t xml:space="preserve"> in the Github repository then click download download raw file icon in the upper right portion of the page.</w:t>
+        <w:t xml:space="preserve"> in the GitHub repository, then click the download raw file icon in the upper right portion of the page.</w:t>
       </w:r>
     </w:p>
     <w:sectPr>
@@ -492,7 +492,7 @@
         <wp:inline distT="0" distB="0" distL="0" distR="0">
           <wp:extent cx="608542" cy="105833"/>
           <wp:effectExtent b="0" l="0" r="0" t="0"/>
-          <wp:docPr id="208" name="" descr="" title=""/>
+          <wp:docPr id="237" name="" descr="" title=""/>
           <wp:cNvGraphicFramePr>
             <a:graphicFrameLocks xmlns:a="http://schemas.openxmlformats.org/drawingml/2006/main" noChangeAspect="1"/>
           </wp:cNvGraphicFramePr>
@@ -570,7 +570,7 @@
 
 <file path=word/numbering.xml><?xml version="1.0" encoding="utf-8"?>
 <w:numbering xmlns:wpc="http://schemas.microsoft.com/office/word/2010/wordprocessingCanvas" xmlns:mc="http://schemas.openxmlformats.org/markup-compatibility/2006" xmlns:o="urn:schemas-microsoft-com:office:office" xmlns:r="http://schemas.openxmlformats.org/officeDocument/2006/relationships" xmlns:m="http://schemas.openxmlformats.org/officeDocument/2006/math" xmlns:v="urn:schemas-microsoft-com:vml" xmlns:wp14="http://schemas.microsoft.com/office/word/2010/wordprocessingDrawing" xmlns:wp="http://schemas.openxmlformats.org/drawingml/2006/wordprocessingDrawing" xmlns:w10="urn:schemas-microsoft-com:office:word" xmlns:w="http://schemas.openxmlformats.org/wordprocessingml/2006/main" xmlns:w14="http://schemas.microsoft.com/office/word/2010/wordml" xmlns:w15="http://schemas.microsoft.com/office/word/2012/wordml" xmlns:wpg="http://schemas.microsoft.com/office/word/2010/wordprocessingGroup" xmlns:wpi="http://schemas.microsoft.com/office/word/2010/wordprocessingInk" xmlns:wne="http://schemas.microsoft.com/office/word/2006/wordml" xmlns:wps="http://schemas.microsoft.com/office/word/2010/wordprocessingShape" mc:Ignorable="w14 w15 wp14">
-  <w:abstractNum w:abstractNumId="209" w15:restartNumberingAfterBreak="0">
+  <w:abstractNum w:abstractNumId="238" w15:restartNumberingAfterBreak="0">
     <w:multiLevelType w:val="hybridMultilevel"/>
     <w:lvl w:ilvl="0" w15:tentative="1">
       <w:start w:val="1"/>
@@ -654,7 +654,7 @@
       </w:pPr>
     </w:lvl>
   </w:abstractNum>
-  <w:abstractNum w:abstractNumId="210" w15:restartNumberingAfterBreak="0">
+  <w:abstractNum w:abstractNumId="239" w15:restartNumberingAfterBreak="0">
     <w:multiLevelType w:val="hybridMultilevel"/>
     <w:lvl w:ilvl="0" w15:tentative="1">
       <w:start w:val="1"/>
@@ -739,13 +739,13 @@
     </w:lvl>
   </w:abstractNum>
   <w:num w:numId="1">
-    <w:abstractNumId w:val="209"/>
+    <w:abstractNumId w:val="238"/>
     <w:lvlOverride w:ilvl="0">
       <w:startOverride w:val="1"/>
     </w:lvlOverride>
   </w:num>
-  <w:num w:numId="211">
-    <w:abstractNumId w:val="210"/>
+  <w:num w:numId="240">
+    <w:abstractNumId w:val="239"/>
     <w:lvlOverride w:ilvl="0">
       <w:startOverride w:val="1"/>
     </w:lvlOverride>

</xml_diff>